<commit_message>
Positioning maps (Price x Brand / Sustainability / Design) as interactive scatter plots in simulator; size-parity note (peer set, not David-vs-Goliath); expanded positioning-maps section with coordinates table and interpretation in Word doc
</commit_message>
<xml_diff>
--- a/Nomade_Vans_Case_v3.0_Simulator_Edition_2026-04-24.docx
+++ b/Nomade_Vans_Case_v3.0_Simulator_Edition_2026-04-24.docx
@@ -184,6 +184,36 @@
         <w:t>To calibrate willingness-to-pay, Nomade surveyed 95 people, asking about demographics, travel habits and the maximum price they would be willing to pay in each of the six rental scenarios. The marketing department also identified three competitors in the relevant market — Further VAN, People Camper and Ocean Vans — currently publishing daily tariffs only.</w:t>
       </w:r>
     </w:p>
+    <w:tbl>
+      <w:tblPr>
+        <w:tblW w:type="auto" w:w="0"/>
+        <w:tblLook w:firstColumn="1" w:firstRow="1" w:lastColumn="0" w:lastRow="0" w:noHBand="0" w:noVBand="1" w:val="04A0"/>
+      </w:tblPr>
+      <w:tblGrid>
+        <w:gridCol w:w="8640"/>
+      </w:tblGrid>
+      <w:tr>
+        <w:tc>
+          <w:tcPr>
+            <w:tcW w:type="dxa" w:w="8640"/>
+            <w:shd w:fill="F5F3FF"/>
+          </w:tcPr>
+          <w:p>
+            <w:r>
+              <w:rPr>
+                <w:b/>
+                <w:color w:val="5B21B6"/>
+              </w:rPr>
+              <w:t xml:space="preserve">Size parity — the competitive set  </w:t>
+            </w:r>
+            <w:r>
+              <w:t>All four players are SIMILAR-SIZED operators in the Spanish sustainable-camper niche. Approximate fleet size: Nomade &lt; 30 vans, Further VAN ~ 50, People Camper ~ 60, Ocean Vans ~ 55. This is a PEER SET, not a David-vs-Goliath fight. The implication matters: the cost-structure advantage of the incumbents is LIMITED — their price premium is mostly driven by BRAND RECOGNITION and first-mover status, not by radically lower unit costs. Nomade can therefore close the gap by building brand perception on its stronger attributes (sustainability, customisation, design).</w:t>
+            </w:r>
+          </w:p>
+        </w:tc>
+      </w:tr>
+    </w:tbl>
+    <w:p/>
     <w:p>
       <w:pPr>
         <w:pStyle w:val="Heading1"/>
@@ -2578,7 +2608,7 @@
           <w:i w:val="0"/>
           <w:sz w:val="22"/>
         </w:rPr>
-        <w:t>A positioning map plots each player on two axes: price (Y) and a key perceived attribute (X — brand recognition, sustainability, comfort, etc.). It is the most direct visual way to see where the white space of the market is and where the closest competitor actually sits.</w:t>
+        <w:t>A positioning map plots each player on two axes: price (Y) and a key perceived attribute (X). It is the most direct visual way to see where the market's white space is, where the closest competitor really sits, and why Nomade ends up charging less despite being objectively more differentiated.</w:t>
       </w:r>
     </w:p>
     <w:p>
@@ -2588,7 +2618,361 @@
           <w:i w:val="0"/>
           <w:sz w:val="22"/>
         </w:rPr>
-        <w:t>In this case you can draw three useful maps:</w:t>
+        <w:t>The four players' coordinates (used by the simulator):</w:t>
+      </w:r>
+    </w:p>
+    <w:tbl>
+      <w:tblPr>
+        <w:tblStyle w:val="LightGrid-Accent1"/>
+        <w:tblW w:type="auto" w:w="0"/>
+        <w:tblLook w:firstColumn="1" w:firstRow="1" w:lastColumn="0" w:lastRow="0" w:noHBand="0" w:noVBand="1" w:val="04A0"/>
+      </w:tblPr>
+      <w:tblGrid>
+        <w:gridCol w:w="1440"/>
+        <w:gridCol w:w="1440"/>
+        <w:gridCol w:w="1440"/>
+        <w:gridCol w:w="1440"/>
+        <w:gridCol w:w="1440"/>
+        <w:gridCol w:w="1440"/>
+      </w:tblGrid>
+      <w:tr>
+        <w:tc>
+          <w:tcPr>
+            <w:tcW w:type="dxa" w:w="1440"/>
+          </w:tcPr>
+          <w:p>
+            <w:r>
+              <w:rPr>
+                <w:b/>
+              </w:rPr>
+              <w:t>Player</w:t>
+            </w:r>
+          </w:p>
+        </w:tc>
+        <w:tc>
+          <w:tcPr>
+            <w:tcW w:type="dxa" w:w="1440"/>
+          </w:tcPr>
+          <w:p>
+            <w:r>
+              <w:rPr>
+                <w:b/>
+              </w:rPr>
+              <w:t>Daily price (€)</w:t>
+            </w:r>
+          </w:p>
+        </w:tc>
+        <w:tc>
+          <w:tcPr>
+            <w:tcW w:type="dxa" w:w="1440"/>
+          </w:tcPr>
+          <w:p>
+            <w:r>
+              <w:rPr>
+                <w:b/>
+              </w:rPr>
+              <w:t>Brand 0–10</w:t>
+            </w:r>
+          </w:p>
+        </w:tc>
+        <w:tc>
+          <w:tcPr>
+            <w:tcW w:type="dxa" w:w="1440"/>
+          </w:tcPr>
+          <w:p>
+            <w:r>
+              <w:rPr>
+                <w:b/>
+              </w:rPr>
+              <w:t>Sustainability 0–10</w:t>
+            </w:r>
+          </w:p>
+        </w:tc>
+        <w:tc>
+          <w:tcPr>
+            <w:tcW w:type="dxa" w:w="1440"/>
+          </w:tcPr>
+          <w:p>
+            <w:r>
+              <w:rPr>
+                <w:b/>
+              </w:rPr>
+              <w:t>Design 0–10</w:t>
+            </w:r>
+          </w:p>
+        </w:tc>
+        <w:tc>
+          <w:tcPr>
+            <w:tcW w:type="dxa" w:w="1440"/>
+          </w:tcPr>
+          <w:p>
+            <w:r>
+              <w:rPr>
+                <w:b/>
+              </w:rPr>
+              <w:t>Fleet size</w:t>
+            </w:r>
+          </w:p>
+        </w:tc>
+      </w:tr>
+      <w:tr>
+        <w:tc>
+          <w:tcPr>
+            <w:tcW w:type="dxa" w:w="1440"/>
+          </w:tcPr>
+          <w:p>
+            <w:r>
+              <w:t>Nomade</w:t>
+            </w:r>
+          </w:p>
+        </w:tc>
+        <w:tc>
+          <w:tcPr>
+            <w:tcW w:type="dxa" w:w="1440"/>
+          </w:tcPr>
+          <w:p>
+            <w:r>
+              <w:t>80</w:t>
+            </w:r>
+          </w:p>
+        </w:tc>
+        <w:tc>
+          <w:tcPr>
+            <w:tcW w:type="dxa" w:w="1440"/>
+          </w:tcPr>
+          <w:p>
+            <w:r>
+              <w:t>3</w:t>
+            </w:r>
+          </w:p>
+        </w:tc>
+        <w:tc>
+          <w:tcPr>
+            <w:tcW w:type="dxa" w:w="1440"/>
+          </w:tcPr>
+          <w:p>
+            <w:r>
+              <w:t>10</w:t>
+            </w:r>
+          </w:p>
+        </w:tc>
+        <w:tc>
+          <w:tcPr>
+            <w:tcW w:type="dxa" w:w="1440"/>
+          </w:tcPr>
+          <w:p>
+            <w:r>
+              <w:t>9</w:t>
+            </w:r>
+          </w:p>
+        </w:tc>
+        <w:tc>
+          <w:tcPr>
+            <w:tcW w:type="dxa" w:w="1440"/>
+          </w:tcPr>
+          <w:p>
+            <w:r>
+              <w:t>&lt; 30 vans</w:t>
+            </w:r>
+          </w:p>
+        </w:tc>
+      </w:tr>
+      <w:tr>
+        <w:tc>
+          <w:tcPr>
+            <w:tcW w:type="dxa" w:w="1440"/>
+          </w:tcPr>
+          <w:p>
+            <w:r>
+              <w:t>Further VAN</w:t>
+            </w:r>
+          </w:p>
+        </w:tc>
+        <w:tc>
+          <w:tcPr>
+            <w:tcW w:type="dxa" w:w="1440"/>
+          </w:tcPr>
+          <w:p>
+            <w:r>
+              <w:t>85</w:t>
+            </w:r>
+          </w:p>
+        </w:tc>
+        <w:tc>
+          <w:tcPr>
+            <w:tcW w:type="dxa" w:w="1440"/>
+          </w:tcPr>
+          <w:p>
+            <w:r>
+              <w:t>8</w:t>
+            </w:r>
+          </w:p>
+        </w:tc>
+        <w:tc>
+          <w:tcPr>
+            <w:tcW w:type="dxa" w:w="1440"/>
+          </w:tcPr>
+          <w:p>
+            <w:r>
+              <w:t>5</w:t>
+            </w:r>
+          </w:p>
+        </w:tc>
+        <w:tc>
+          <w:tcPr>
+            <w:tcW w:type="dxa" w:w="1440"/>
+          </w:tcPr>
+          <w:p>
+            <w:r>
+              <w:t>7</w:t>
+            </w:r>
+          </w:p>
+        </w:tc>
+        <w:tc>
+          <w:tcPr>
+            <w:tcW w:type="dxa" w:w="1440"/>
+          </w:tcPr>
+          <w:p>
+            <w:r>
+              <w:t>~ 50 vans</w:t>
+            </w:r>
+          </w:p>
+        </w:tc>
+      </w:tr>
+      <w:tr>
+        <w:tc>
+          <w:tcPr>
+            <w:tcW w:type="dxa" w:w="1440"/>
+          </w:tcPr>
+          <w:p>
+            <w:r>
+              <w:t>People Camper</w:t>
+            </w:r>
+          </w:p>
+        </w:tc>
+        <w:tc>
+          <w:tcPr>
+            <w:tcW w:type="dxa" w:w="1440"/>
+          </w:tcPr>
+          <w:p>
+            <w:r>
+              <w:t>105</w:t>
+            </w:r>
+          </w:p>
+        </w:tc>
+        <w:tc>
+          <w:tcPr>
+            <w:tcW w:type="dxa" w:w="1440"/>
+          </w:tcPr>
+          <w:p>
+            <w:r>
+              <w:t>9</w:t>
+            </w:r>
+          </w:p>
+        </w:tc>
+        <w:tc>
+          <w:tcPr>
+            <w:tcW w:type="dxa" w:w="1440"/>
+          </w:tcPr>
+          <w:p>
+            <w:r>
+              <w:t>4</w:t>
+            </w:r>
+          </w:p>
+        </w:tc>
+        <w:tc>
+          <w:tcPr>
+            <w:tcW w:type="dxa" w:w="1440"/>
+          </w:tcPr>
+          <w:p>
+            <w:r>
+              <w:t>6</w:t>
+            </w:r>
+          </w:p>
+        </w:tc>
+        <w:tc>
+          <w:tcPr>
+            <w:tcW w:type="dxa" w:w="1440"/>
+          </w:tcPr>
+          <w:p>
+            <w:r>
+              <w:t>~ 60 vans</w:t>
+            </w:r>
+          </w:p>
+        </w:tc>
+      </w:tr>
+      <w:tr>
+        <w:tc>
+          <w:tcPr>
+            <w:tcW w:type="dxa" w:w="1440"/>
+          </w:tcPr>
+          <w:p>
+            <w:r>
+              <w:t>Ocean Vans</w:t>
+            </w:r>
+          </w:p>
+        </w:tc>
+        <w:tc>
+          <w:tcPr>
+            <w:tcW w:type="dxa" w:w="1440"/>
+          </w:tcPr>
+          <w:p>
+            <w:r>
+              <w:t>98</w:t>
+            </w:r>
+          </w:p>
+        </w:tc>
+        <w:tc>
+          <w:tcPr>
+            <w:tcW w:type="dxa" w:w="1440"/>
+          </w:tcPr>
+          <w:p>
+            <w:r>
+              <w:t>9</w:t>
+            </w:r>
+          </w:p>
+        </w:tc>
+        <w:tc>
+          <w:tcPr>
+            <w:tcW w:type="dxa" w:w="1440"/>
+          </w:tcPr>
+          <w:p>
+            <w:r>
+              <w:t>6</w:t>
+            </w:r>
+          </w:p>
+        </w:tc>
+        <w:tc>
+          <w:tcPr>
+            <w:tcW w:type="dxa" w:w="1440"/>
+          </w:tcPr>
+          <w:p>
+            <w:r>
+              <w:t>7</w:t>
+            </w:r>
+          </w:p>
+        </w:tc>
+        <w:tc>
+          <w:tcPr>
+            <w:tcW w:type="dxa" w:w="1440"/>
+          </w:tcPr>
+          <w:p>
+            <w:r>
+              <w:t>~ 55 vans</w:t>
+            </w:r>
+          </w:p>
+        </w:tc>
+      </w:tr>
+    </w:tbl>
+    <w:p/>
+    <w:p>
+      <w:r>
+        <w:rPr>
+          <w:b/>
+          <w:i w:val="0"/>
+          <w:sz w:val="22"/>
+        </w:rPr>
+        <w:t>Three useful maps — tick them on Competition-based → Graph picker:</w:t>
       </w:r>
     </w:p>
     <w:p>
@@ -2596,7 +2980,7 @@
         <w:pStyle w:val="ListBullet"/>
       </w:pPr>
       <w:r>
-        <w:t>Price × Brand recognition — shows that Nomade sits LOW on brand but can still take a middle-price position by leveraging the sustainability axis.</w:t>
+        <w:t>Price × Brand recognition — Nomade is bottom-left (low brand, low price); competitors are top-right (high brand, high price). The price gap mirrors the brand gap almost perfectly.</w:t>
       </w:r>
     </w:p>
     <w:p>
@@ -2604,7 +2988,7 @@
         <w:pStyle w:val="ListBullet"/>
       </w:pPr>
       <w:r>
-        <w:t>Price × Sustainability — the axis where Nomade scores 10/10. The map makes the differentiation obvious and justifies a skimming-style move on Premium.</w:t>
+        <w:t>Price × Sustainability — the picture flips: Nomade is top-right (best score, 10/10) yet the LEAST expensive. The competitors sit bottom-left, with People Camper the weakest on sustainability (4/10). This map alone justifies a skimming move on Premium.</w:t>
       </w:r>
     </w:p>
     <w:p>
@@ -2612,9 +2996,39 @@
         <w:pStyle w:val="ListBullet"/>
       </w:pPr>
       <w:r>
-        <w:t>Price × Versatility (number of tariffs / tiers) — Nomade is ALONE with 2 tiers and 3 periods. The others are single-tier + daily-only. The asymmetry is itself a positioning lever (anchoring sandwich, flexible bundles).</w:t>
+        <w:t>Price × Design / customisation — Nomade is mid-top (9/10 on design, €80 price). Competitors cluster mid-price / mid-design. This shows that the pricing gap is NOT explained by product inferiority.</w:t>
       </w:r>
     </w:p>
+    <w:tbl>
+      <w:tblPr>
+        <w:tblW w:type="auto" w:w="0"/>
+        <w:tblLook w:firstColumn="1" w:firstRow="1" w:lastColumn="0" w:lastRow="0" w:noHBand="0" w:noVBand="1" w:val="04A0"/>
+      </w:tblPr>
+      <w:tblGrid>
+        <w:gridCol w:w="8640"/>
+      </w:tblGrid>
+      <w:tr>
+        <w:tc>
+          <w:tcPr>
+            <w:tcW w:type="dxa" w:w="8640"/>
+            <w:shd w:fill="F5F3FF"/>
+          </w:tcPr>
+          <w:p>
+            <w:r>
+              <w:rPr>
+                <w:b/>
+                <w:color w:val="5B21B6"/>
+              </w:rPr>
+              <w:t xml:space="preserve">Why Nomade charges less — and what to do about it  </w:t>
+            </w:r>
+            <w:r>
+              <w:t>The three maps together tell the story: Nomade's lower price is NOT explained by inferior product or by a structural cost disadvantage (sizes are similar). It is explained almost entirely by the BRAND RECOGNITION gap. The strategic implication is therefore clear — invest in brand perception (narrative, channels, reviews, endorsements) to move UP the price axis without having to touch the product.</w:t>
+            </w:r>
+          </w:p>
+        </w:tc>
+      </w:tr>
+    </w:tbl>
+    <w:p/>
     <w:p>
       <w:r>
         <w:rPr>
@@ -2623,7 +3037,7 @@
           <w:color w:val="64748B"/>
           <w:sz w:val="22"/>
         </w:rPr>
-        <w:t>The simulator renders these ideas in a single chart titled "Std+Prem × Day/Weekend/Week + competitors" — tick it on the Competition-based tab. The two Nomade bars (blue/orange) sit next to the three competitor bars (pale blue / purple / green), so the sandwich vs single-tariff picture appears in one glance.</w:t>
+        <w:t>A fourth axis — versatility (number of tariffs / tiers) — is where Nomade is ALONE: two tiers and three periods vs the competitors' single-tier, daily-only offer. That asymmetry is itself a positioning lever (anchoring sandwich, flexible bundles) and is rendered in the simulator under the "Std+Prem × Day/Weekend/Week + competitors" chart.</w:t>
       </w:r>
     </w:p>
     <w:p>

</xml_diff>

<commit_message>
Word doc: positioning-maps section rewritten to match the simulator exactly — 3 maps with per-map reading, two visible locations (How-to-use + Competition-based), size-parity + skimming-vs-penetration reasoning tightened
</commit_message>
<xml_diff>
--- a/Nomade_Vans_Case_v3.0_Simulator_Edition_2026-04-24.docx
+++ b/Nomade_Vans_Case_v3.0_Simulator_Edition_2026-04-24.docx
@@ -2608,7 +2608,18 @@
           <w:i w:val="0"/>
           <w:sz w:val="22"/>
         </w:rPr>
-        <w:t>A positioning map plots each player on two axes: price (Y) and a key perceived attribute (X). It is the most direct visual way to see where the market's white space is, where the closest competitor really sits, and why Nomade ends up charging less despite being objectively more differentiated.</w:t>
+        <w:t>A positioning map plots each player on two axes: price (Y) and a key perceived attribute (X). It is the most direct way to see where the market's white space is, where the closest competitor actually sits, and why Nomade ends up charging less despite being objectively more differentiated.</w:t>
+      </w:r>
+    </w:p>
+    <w:p>
+      <w:r>
+        <w:rPr>
+          <w:b w:val="0"/>
+          <w:i/>
+          <w:color w:val="64748B"/>
+          <w:sz w:val="22"/>
+        </w:rPr>
+        <w:t>The simulator renders three interactive positioning maps — they are visible in TWO places: (a) inside the How-to-use tab, directly below the "Why Nomade charges less" explanation, and (b) on the Competition-based tab as a dedicated purple card. Each of the four players appears as a coloured dot with its name next to it.</w:t>
       </w:r>
     </w:p>
     <w:p>
@@ -2618,7 +2629,7 @@
           <w:i w:val="0"/>
           <w:sz w:val="22"/>
         </w:rPr>
-        <w:t>The four players' coordinates (used by the simulator):</w:t>
+        <w:t>The four players' coordinates (the exact values plotted by the simulator):</w:t>
       </w:r>
     </w:p>
     <w:tbl>
@@ -2970,9 +2981,10 @@
         <w:rPr>
           <w:b/>
           <w:i w:val="0"/>
+          <w:color w:val="5B21B6"/>
           <w:sz w:val="22"/>
         </w:rPr>
-        <w:t>Three useful maps — tick them on Competition-based → Graph picker:</w:t>
+        <w:t>Map 1 — Price × Brand recognition</w:t>
       </w:r>
     </w:p>
     <w:p>
@@ -2980,7 +2992,7 @@
         <w:pStyle w:val="ListBullet"/>
       </w:pPr>
       <w:r>
-        <w:t>Price × Brand recognition — Nomade is bottom-left (low brand, low price); competitors are top-right (high brand, high price). The price gap mirrors the brand gap almost perfectly.</w:t>
+        <w:t>Nomade sits in the BOTTOM-LEFT (brand 3/10, €80). Competitors cluster in the TOP-RIGHT (brand 8–9/10, €85–€105).</w:t>
       </w:r>
     </w:p>
     <w:p>
@@ -2988,7 +3000,7 @@
         <w:pStyle w:val="ListBullet"/>
       </w:pPr>
       <w:r>
-        <w:t>Price × Sustainability — the picture flips: Nomade is top-right (best score, 10/10) yet the LEAST expensive. The competitors sit bottom-left, with People Camper the weakest on sustainability (4/10). This map alone justifies a skimming move on Premium.</w:t>
+        <w:t>Reading: the price gap mirrors the brand gap almost perfectly. Further VAN at 8/10 brand → €85 · People Camper and Ocean Vans at 9/10 brand → €98–€105 · Nomade at 3/10 → €80.</w:t>
       </w:r>
     </w:p>
     <w:p>
@@ -2996,7 +3008,77 @@
         <w:pStyle w:val="ListBullet"/>
       </w:pPr>
       <w:r>
-        <w:t>Price × Design / customisation — Nomade is mid-top (9/10 on design, €80 price). Competitors cluster mid-price / mid-design. This shows that the pricing gap is NOT explained by product inferiority.</w:t>
+        <w:t>Diagonal of the map = "price-per-unit-of-brand". Nomade is ON the diagonal — not under-priced vs its brand, simply unknown.</w:t>
+      </w:r>
+    </w:p>
+    <w:p>
+      <w:r>
+        <w:rPr>
+          <w:b/>
+          <w:i w:val="0"/>
+          <w:color w:val="5B21B6"/>
+          <w:sz w:val="22"/>
+        </w:rPr>
+        <w:t>Map 2 — Price × Sustainability</w:t>
+      </w:r>
+    </w:p>
+    <w:p>
+      <w:pPr>
+        <w:pStyle w:val="ListBullet"/>
+      </w:pPr>
+      <w:r>
+        <w:t>Picture FLIPS: Nomade moves to the TOP-RIGHT (sustainability 10/10) while still being the cheapest.</w:t>
+      </w:r>
+    </w:p>
+    <w:p>
+      <w:pPr>
+        <w:pStyle w:val="ListBullet"/>
+      </w:pPr>
+      <w:r>
+        <w:t>People Camper is bottom-left (4/10) at the highest price (€105) — the opposite of value-for-money on this axis.</w:t>
+      </w:r>
+    </w:p>
+    <w:p>
+      <w:pPr>
+        <w:pStyle w:val="ListBullet"/>
+      </w:pPr>
+      <w:r>
+        <w:t>Reading: Nomade is clearly under-priced if customers actually valued sustainability as much as the product delivers. This is the strongest argument for a Premium-tier skimming move (+).</w:t>
+      </w:r>
+    </w:p>
+    <w:p>
+      <w:r>
+        <w:rPr>
+          <w:b/>
+          <w:i w:val="0"/>
+          <w:color w:val="5B21B6"/>
+          <w:sz w:val="22"/>
+        </w:rPr>
+        <w:t>Map 3 — Price × Design / customisation</w:t>
+      </w:r>
+    </w:p>
+    <w:p>
+      <w:pPr>
+        <w:pStyle w:val="ListBullet"/>
+      </w:pPr>
+      <w:r>
+        <w:t>Nomade at 9/10 design, €80 — still cheapest despite the highest design score.</w:t>
+      </w:r>
+    </w:p>
+    <w:p>
+      <w:pPr>
+        <w:pStyle w:val="ListBullet"/>
+      </w:pPr>
+      <w:r>
+        <w:t>Competitors 6–7/10 design at €85–€105.</w:t>
+      </w:r>
+    </w:p>
+    <w:p>
+      <w:pPr>
+        <w:pStyle w:val="ListBullet"/>
+      </w:pPr>
+      <w:r>
+        <w:t>Reading: the pricing gap is NOT explained by product inferiority. The product is better; the perception is weaker.</w:t>
       </w:r>
     </w:p>
     <w:tbl>
@@ -3022,7 +3104,7 @@
               <w:t xml:space="preserve">Why Nomade charges less — and what to do about it  </w:t>
             </w:r>
             <w:r>
-              <w:t>The three maps together tell the story: Nomade's lower price is NOT explained by inferior product or by a structural cost disadvantage (sizes are similar). It is explained almost entirely by the BRAND RECOGNITION gap. The strategic implication is therefore clear — invest in brand perception (narrative, channels, reviews, endorsements) to move UP the price axis without having to touch the product.</w:t>
+              <w:t>The three maps together tell the same story: Nomade's lower price is NOT explained by inferior product or by a structural cost disadvantage (fleet sizes are similar — this is a peer set, not David vs Goliath). It is explained almost entirely by the BRAND-RECOGNITION gap. The strategic implication is therefore clear — invest in brand perception (narrative, channels, reviews, endorsements) to move UP the price axis on the brand map without eroding the advantage on the sustainability and design maps. That is the justification for a skimming move (+) on Premium and a gentle penetration (−) on Standard only in year 1 (seed trials), rather than aggressive price cuts (−−).</w:t>
             </w:r>
           </w:p>
         </w:tc>
@@ -3097,7 +3179,7 @@
         <w:pStyle w:val="ListNumber"/>
       </w:pPr>
       <w:r>
-        <w:t>Competition-based → Profit curve: DRAG the green "Our price" line. Coloured dashed lines are competitors; KPIs (profit, demand, revenue, lost-vs-peak) update live. Use Match-competitor / Snap-to-peak quick-jump buttons.</w:t>
+        <w:t>Competition-based → Profit curve: DRAG the green "Our price" line. Coloured dashed lines are competitors; KPIs (profit, demand, revenue, lost-vs-peak) update live. Use Match-competitor / Snap-to-peak quick-jump buttons. Scroll further to see the THREE POSITIONING MAPS (Price × Brand / Sustainability / Design) in the purple card — these answer Q1 visually.</w:t>
       </w:r>
     </w:p>
     <w:p>

</xml_diff>